<commit_message>
docs: add MiniFMS mini-project blueprint and step-by-step guide
</commit_message>
<xml_diff>
--- a/01_Projects/FMS_Backend_Engineering_Guide_OneByOne.docx
+++ b/01_Projects/FMS_Backend_Engineering_Guide_OneByOne.docx
@@ -15,7 +15,7 @@
         </w:rPr>
         <w:t>FREIGHT MANAGEMENT SYSTEM (FMS)</w:t>
         <w:br/>
-        <w:t>BACKEND ENGINEERING MASTERCLASS</w:t>
+        <w:t>BACKEND MASTERCLASS &amp; MINI-PROJECT BLUEPRINT</w:t>
       </w:r>
     </w:p>
     <w:p>
@@ -28,7 +28,7 @@
           <w:color w:val="646464"/>
           <w:sz w:val="22"/>
         </w:rPr>
-        <w:t>Arsitektur Domain, Integrasi CargoWise, &amp; Panduan Transisi ke .NET / Microsoft Enterprise Ecosystem.</w:t>
+        <w:t>Arsitektur Domain, Integrasi CargoWise, Ekosistem .NET, dan Panduan Praktis Mini-Project 'MiniFMS'.</w:t>
       </w:r>
     </w:p>
     <w:tbl>
@@ -70,7 +70,7 @@
                 <w:color w:val="1E3A8A"/>
                 <w:sz w:val="20"/>
               </w:rPr>
-              <w:t>📌 KONTEKS TEKNOLOGI ONEBYONE LOGISTICAL</w:t>
+              <w:t>📌 TUJUAN DOKUMEN</w:t>
               <w:br/>
             </w:r>
             <w:r>
@@ -79,7 +79,7 @@
                 <w:color w:val="333333"/>
                 <w:sz w:val="19"/>
               </w:rPr>
-              <w:t>Backend FMS di OneByOne Logistical dibangun menggunakan platform .NET / C# dan ekosistem Microsoft (ASP.NET Core, EF Core / Dapper, Azure Service Bus / MassTransit, SQL Server). Dokumen ini mengintegrasikan seluruh domain logistik dengan pemetaan konsep dari Go/TypeScript ke .NET modern (.NET 8/9), pola arsitektur Clean/CQRS, dan implementasi kode nyata.</w:t>
+              <w:t>Dokumen ini menyediakan landasan teori, analisis domain logistik, pemetaan arsitektur .NET / C#, serta rancangan step-by-step pembuatan mini-project praktis ('MiniFMS') untuk mengasah keterampilan Anda menjelang persiapan kerja di OneByOne Logistical.</w:t>
             </w:r>
           </w:p>
         </w:tc>
@@ -410,7 +410,7 @@
                 <w:color w:val="333333"/>
                 <w:sz w:val="17"/>
               </w:rPr>
-              <w:t>Dasar penetapan tarif. Laut: 1 CBM = 1.000 kg. Udara: 1 CBM = 167 kg (rasio 1:6000 atau 1:5000 cm3/kg). Penagihan memakai chargeable weight tertinggi.</w:t>
+              <w:t>Dasar penetapan tarif. Laut: 1 CBM = 1000 kg. Udara: 1 CBM = 167 kg. Penagihan memakai chargeable weight tertinggi.</w:t>
             </w:r>
           </w:p>
         </w:tc>
@@ -478,7 +478,7 @@
                 <w:color w:val="333333"/>
                 <w:sz w:val="17"/>
               </w:rPr>
-              <w:t>Aturan pembagian biaya &amp; risiko internasional. Contoh: FOB (biaya lokal asal oleh shipper, ocean freight oleh consignee), CIF, DDP, EXW.</w:t>
+              <w:t>Aturan pembagian biaya &amp; risiko internasional (FOB, CIF, DDP, EXW).</w:t>
             </w:r>
           </w:p>
         </w:tc>
@@ -546,7 +546,7 @@
                 <w:color w:val="333333"/>
                 <w:sz w:val="17"/>
               </w:rPr>
-              <w:t>Kode 5 karakter lokasi pelabuhan global. IDJKT (Tanjung Priok), IDSUB (Tanjung Perak), SGSIN (Singapura), USLAX (Los Angeles).</w:t>
+              <w:t>Kode 5 karakter lokasi pelabuhan global (IDJKT, SGSIN, USLAX).</w:t>
             </w:r>
           </w:p>
         </w:tc>
@@ -970,7 +970,7 @@
                 <w:color w:val="333333"/>
                 <w:sz w:val="17"/>
               </w:rPr>
-              <w:t>Dokumen angkutan udara. Bersifat non-negotiable (bukan dokumen hak milik, melainkan tanda terima angkutan).</w:t>
+              <w:t>Dokumen angkutan udara. Bersifat non-negotiable (bukan dokumen hak milik).</w:t>
             </w:r>
           </w:p>
         </w:tc>
@@ -1060,7 +1060,7 @@
                 <w:color w:val="333333"/>
                 <w:sz w:val="17"/>
               </w:rPr>
-              <w:t>Instruksi tertulis rincian muatan yang menjadi input pembuatan draf B/L sebelum final cut-off time.</w:t>
+              <w:t>Instruksi tertulis rincian muatan yang menjadi input pembuatan draf B/L.</w:t>
             </w:r>
           </w:p>
         </w:tc>
@@ -1120,7 +1120,7 @@
           <w:color w:val="333333"/>
           <w:sz w:val="20"/>
         </w:rPr>
-        <w:t>DRAFT -&gt; BOOKING_CONFIRMED -&gt; EMPTY_CONTAINER_PICKED -&gt; GATED_IN_ORIGIN (CY) -&gt; LOADED_ON_VESSEL -&gt; DEPARTED (POL) -&gt; IN_TRANSIT -&gt; DISCHARGED (POD) -&gt; CUSTOMS_RELEASED -&gt; GATED_OUT_DESTINATION -&gt; DELIVERED_CONSIGNEE -&gt; EMPTY_RETURNED.</w:t>
+        <w:t>DRAFT -&gt; BOOKING_CONFIRMED -&gt; GATED_IN_ORIGIN -&gt; LOADED_ON_VESSEL -&gt; DEPARTED (POL) -&gt; IN_TRANSIT -&gt; DISCHARGED (POD) -&gt; CUSTOMS_RELEASED -&gt; DELIVERED.</w:t>
       </w:r>
     </w:p>
     <w:p>
@@ -1135,7 +1135,7 @@
           <w:color w:val="1E1E1E"/>
           <w:sz w:val="20"/>
         </w:rPr>
-        <w:t xml:space="preserve">Tantangan Concurrency Webhook: </w:t>
+        <w:t xml:space="preserve">Idempotency Webhook: </w:t>
       </w:r>
       <w:r>
         <w:rPr>
@@ -1143,7 +1143,7 @@
           <w:color w:val="333333"/>
           <w:sz w:val="20"/>
         </w:rPr>
-        <w:t>Sistem tracking pihak ketiga sering mengirim webhook tidak berurutan (misal: webhook Gate-Out tiba lebih cepat daripada Gate-In akibat network retry). Backend wajib memvalidasi event timestamp aktual (EventOccurrenceTime) dan bukan timestamp penerimaan webhook.</w:t>
+        <w:t>Pencegahan duplikasi event tracking menggunakan Redis untuk memastikan webhook yang diterima dua kali tidak merusak data status kargo.</w:t>
       </w:r>
     </w:p>
     <w:p>
@@ -1172,53 +1172,7 @@
           <w:color w:val="333333"/>
           <w:sz w:val="20"/>
         </w:rPr>
-        <w:t>FMS enterprise di perusahaan logistik kelas dunia hampir selalu terintegrasi dengan ekosistem CargoWise (WiseTech Global).</w:t>
-      </w:r>
-    </w:p>
-    <w:p>
-      <w:pPr>
-        <w:pStyle w:val="ListBullet"/>
-        <w:spacing w:before="0" w:after="40" w:line="276" w:lineRule="auto"/>
-      </w:pPr>
-      <w:r>
-        <w:rPr>
-          <w:rFonts w:ascii="Calibri" w:hAnsi="Calibri"/>
-          <w:b/>
-          <w:color w:val="1E1E1E"/>
-          <w:sz w:val="20"/>
-        </w:rPr>
-        <w:t xml:space="preserve">CargoWise eAdaptor Architecture: </w:t>
-      </w:r>
-      <w:r>
-        <w:rPr>
-          <w:rFonts w:ascii="Calibri" w:hAnsi="Calibri"/>
-          <w:color w:val="333333"/>
-          <w:sz w:val="20"/>
-        </w:rPr>
-        <w:t>Modul integrasi B2B resmi CargoWise yang menggunakan protokol XML/SOAP atau REST webhook. Dokumen standar yang dipertukarkan adalah UniversalShipment (format XML kompleks yang mencakup informasi order, booking, kontainer, milestones, dan invoice).</w:t>
-      </w:r>
-    </w:p>
-    <w:p>
-      <w:pPr>
-        <w:pStyle w:val="ListBullet"/>
-        <w:spacing w:before="0" w:after="40" w:line="276" w:lineRule="auto"/>
-      </w:pPr>
-      <w:r>
-        <w:rPr>
-          <w:rFonts w:ascii="Calibri" w:hAnsi="Calibri"/>
-          <w:b/>
-          <w:color w:val="1E1E1E"/>
-          <w:sz w:val="20"/>
-        </w:rPr>
-        <w:t xml:space="preserve">CEISA 4.0 Bea Cukai Indonesia: </w:t>
-      </w:r>
-      <w:r>
-        <w:rPr>
-          <w:rFonts w:ascii="Calibri" w:hAnsi="Calibri"/>
-          <w:color w:val="333333"/>
-          <w:sz w:val="20"/>
-        </w:rPr>
-        <w:t>Integrasi pengajuan dokumen pabean ekspor (PEB) dan impor (PIB) melalui API resmi Bea Cukai menggunakan pertukaran data JSON/XML terenkripsi.</w:t>
+        <w:t>FMS enterprise terintegrasi dengan ekosistem CargoWise (WiseTech Global) menggunakan pertukaran data XML/SOAP (UniversalShipment) serta portal Bea Cukai Indonesia (CEISA 4.0).</w:t>
       </w:r>
     </w:p>
     <w:p>
@@ -1247,7 +1201,82 @@
           <w:color w:val="333333"/>
           <w:sz w:val="20"/>
         </w:rPr>
-        <w:t>Sektor logistik global memilih .NET karena stabilitas type safety, integrasi native dengan Windows/Office, serta performa runtime modern yang sangat tinggi pada .NET 8 dan .NET 9.</w:t>
+        <w:t>Sektor logistik global memilih .NET karena stabilitas type safety, integrasi native dengan ekosistem enterprise, dan performa tinggi pada .NET 8/9.</w:t>
+      </w:r>
+    </w:p>
+    <w:p>
+      <w:pPr>
+        <w:pStyle w:val="ListBullet"/>
+        <w:spacing w:before="0" w:after="40" w:line="276" w:lineRule="auto"/>
+      </w:pPr>
+      <w:r>
+        <w:rPr>
+          <w:rFonts w:ascii="Calibri" w:hAnsi="Calibri"/>
+          <w:b/>
+          <w:color w:val="1E1E1E"/>
+          <w:sz w:val="20"/>
+        </w:rPr>
+        <w:t xml:space="preserve">Mental Model Mapping: </w:t>
+      </w:r>
+      <w:r>
+        <w:rPr>
+          <w:rFonts w:ascii="Calibri" w:hAnsi="Calibri"/>
+          <w:color w:val="333333"/>
+          <w:sz w:val="20"/>
+        </w:rPr>
+        <w:t>Goroutine/Channel di Go setara dengan async/await Task di C#. GORM setara dengan EF Core. Middleware HTTP net/http setara dengan ASP.NET Core Middleware Pipeline.</w:t>
+      </w:r>
+    </w:p>
+    <w:p>
+      <w:pPr>
+        <w:pStyle w:val="ListBullet"/>
+        <w:spacing w:before="0" w:after="40" w:line="276" w:lineRule="auto"/>
+      </w:pPr>
+      <w:r>
+        <w:rPr>
+          <w:rFonts w:ascii="Calibri" w:hAnsi="Calibri"/>
+          <w:b/>
+          <w:color w:val="1E1E1E"/>
+          <w:sz w:val="20"/>
+        </w:rPr>
+        <w:t xml:space="preserve">Architecture Pattern: </w:t>
+      </w:r>
+      <w:r>
+        <w:rPr>
+          <w:rFonts w:ascii="Calibri" w:hAnsi="Calibri"/>
+          <w:color w:val="333333"/>
+          <w:sz w:val="20"/>
+        </w:rPr>
+        <w:t>Clean Architecture &amp; CQRS (MediatR) memisahkan Domain, Application, Infrastructure, dan API Layer secara bersih.</w:t>
+      </w:r>
+    </w:p>
+    <w:p>
+      <w:pPr>
+        <w:pStyle w:val="Heading1"/>
+        <w:keepNext/>
+        <w:spacing w:before="280" w:after="80"/>
+      </w:pPr>
+      <w:r>
+        <w:rPr>
+          <w:rFonts w:ascii="Calibri" w:hAnsi="Calibri"/>
+          <w:color w:val="1E3A8A"/>
+          <w:sz w:val="30"/>
+        </w:rPr>
+        <w:t>6. Rancangan Praktis Mini-Project: 'MiniFMS'</w:t>
+      </w:r>
+    </w:p>
+    <w:p>
+      <w:pPr>
+        <w:spacing w:before="0" w:after="60" w:line="276" w:lineRule="auto"/>
+      </w:pPr>
+      <w:r>
+        <w:rPr>
+          <w:rFonts w:ascii="Calibri" w:hAnsi="Calibri"/>
+          <w:i w:val="0"/>
+          <w:color w:val="333333"/>
+          <w:sz w:val="20"/>
+        </w:rPr>
+        <w:t>Untuk menguasai teori di atas secara hands-on, buatlah mini-project backend ASP.NET Core Web API bernama MiniFMS dengan spesifikasi dan langkah pengerjaan berikut:</w:t>
       </w:r>
     </w:p>
     <w:p>
@@ -1262,715 +1291,7 @@
           <w:color w:val="334155"/>
           <w:sz w:val="25"/>
         </w:rPr>
-        <w:t>A. Pemetaan Konsep: Go / TypeScript ke C# &amp; .NET</w:t>
-      </w:r>
-    </w:p>
-    <w:p>
-      <w:pPr>
-        <w:spacing w:before="0" w:after="60" w:line="276" w:lineRule="auto"/>
-      </w:pPr>
-      <w:r>
-        <w:rPr>
-          <w:rFonts w:ascii="Calibri" w:hAnsi="Calibri"/>
-          <w:i w:val="0"/>
-          <w:color w:val="333333"/>
-          <w:sz w:val="20"/>
-        </w:rPr>
-        <w:t>Sebagai engineer dengan latar belakang Go dan TypeScript, berikut jembatan mental yang perlu dipahami:</w:t>
-      </w:r>
-    </w:p>
-    <w:tbl>
-      <w:tblPr>
-        <w:tblW w:type="auto" w:w="0"/>
-        <w:jc w:val="center"/>
-        <w:tblLayout w:type="fixed"/>
-        <w:tblLook w:firstColumn="1" w:firstRow="1" w:lastColumn="0" w:lastRow="0" w:noHBand="0" w:noVBand="1" w:val="04A0"/>
-      </w:tblPr>
-      <w:tblGrid>
-        <w:gridCol w:w="2484"/>
-        <w:gridCol w:w="2484"/>
-        <w:gridCol w:w="2484"/>
-        <w:gridCol w:w="2484"/>
-      </w:tblGrid>
-      <w:tr>
-        <w:tc>
-          <w:tcPr>
-            <w:tcW w:type="dxa" w:w="1584"/>
-            <w:shd w:fill="1E3A8A"/>
-            <w:tcMar>
-              <w:top w:w="80" w:type="dxa"/>
-              <w:bottom w:w="80" w:type="dxa"/>
-              <w:left w:w="100" w:type="dxa"/>
-              <w:right w:w="100" w:type="dxa"/>
-            </w:tcMar>
-          </w:tcPr>
-          <w:p>
-            <w:pPr>
-              <w:jc w:val="center"/>
-            </w:pPr>
-            <w:r>
-              <w:rPr>
-                <w:rFonts w:ascii="Calibri" w:hAnsi="Calibri"/>
-                <w:b/>
-                <w:color w:val="FFFFFF"/>
-                <w:sz w:val="18"/>
-              </w:rPr>
-              <w:t>Aspek Backend</w:t>
-            </w:r>
-          </w:p>
-        </w:tc>
-        <w:tc>
-          <w:tcPr>
-            <w:tcW w:type="dxa" w:w="1728"/>
-            <w:shd w:fill="1E3A8A"/>
-            <w:tcMar>
-              <w:top w:w="80" w:type="dxa"/>
-              <w:bottom w:w="80" w:type="dxa"/>
-              <w:left w:w="100" w:type="dxa"/>
-              <w:right w:w="100" w:type="dxa"/>
-            </w:tcMar>
-          </w:tcPr>
-          <w:p>
-            <w:pPr>
-              <w:jc w:val="center"/>
-            </w:pPr>
-            <w:r>
-              <w:rPr>
-                <w:rFonts w:ascii="Calibri" w:hAnsi="Calibri"/>
-                <w:b/>
-                <w:color w:val="FFFFFF"/>
-                <w:sz w:val="18"/>
-              </w:rPr>
-              <w:t>Konsep di Go</w:t>
-            </w:r>
-          </w:p>
-        </w:tc>
-        <w:tc>
-          <w:tcPr>
-            <w:tcW w:type="dxa" w:w="1872"/>
-            <w:shd w:fill="1E3A8A"/>
-            <w:tcMar>
-              <w:top w:w="80" w:type="dxa"/>
-              <w:bottom w:w="80" w:type="dxa"/>
-              <w:left w:w="100" w:type="dxa"/>
-              <w:right w:w="100" w:type="dxa"/>
-            </w:tcMar>
-          </w:tcPr>
-          <w:p>
-            <w:pPr>
-              <w:jc w:val="center"/>
-            </w:pPr>
-            <w:r>
-              <w:rPr>
-                <w:rFonts w:ascii="Calibri" w:hAnsi="Calibri"/>
-                <w:b/>
-                <w:color w:val="FFFFFF"/>
-                <w:sz w:val="18"/>
-              </w:rPr>
-              <w:t>Setara di C# / .NET 8+</w:t>
-            </w:r>
-          </w:p>
-        </w:tc>
-        <w:tc>
-          <w:tcPr>
-            <w:tcW w:type="dxa" w:w="4608"/>
-            <w:shd w:fill="1E3A8A"/>
-            <w:tcMar>
-              <w:top w:w="80" w:type="dxa"/>
-              <w:bottom w:w="80" w:type="dxa"/>
-              <w:left w:w="100" w:type="dxa"/>
-              <w:right w:w="100" w:type="dxa"/>
-            </w:tcMar>
-          </w:tcPr>
-          <w:p>
-            <w:pPr>
-              <w:jc w:val="center"/>
-            </w:pPr>
-            <w:r>
-              <w:rPr>
-                <w:rFonts w:ascii="Calibri" w:hAnsi="Calibri"/>
-                <w:b/>
-                <w:color w:val="FFFFFF"/>
-                <w:sz w:val="18"/>
-              </w:rPr>
-              <w:t>Catatan &amp; Perbedaan Praktis</w:t>
-            </w:r>
-          </w:p>
-        </w:tc>
-      </w:tr>
-      <w:tr>
-        <w:tc>
-          <w:tcPr>
-            <w:tcW w:type="dxa" w:w="1584"/>
-            <w:shd w:fill="FFFFFF"/>
-            <w:tcMar>
-              <w:top w:w="60" w:type="dxa"/>
-              <w:bottom w:w="60" w:type="dxa"/>
-              <w:left w:w="100" w:type="dxa"/>
-              <w:right w:w="100" w:type="dxa"/>
-            </w:tcMar>
-          </w:tcPr>
-          <w:p>
-            <w:r>
-              <w:rPr>
-                <w:rFonts w:ascii="Calibri" w:hAnsi="Calibri"/>
-                <w:color w:val="333333"/>
-                <w:sz w:val="17"/>
-              </w:rPr>
-              <w:t>Concurrency</w:t>
-            </w:r>
-          </w:p>
-        </w:tc>
-        <w:tc>
-          <w:tcPr>
-            <w:tcW w:type="dxa" w:w="1728"/>
-            <w:shd w:fill="FFFFFF"/>
-            <w:tcMar>
-              <w:top w:w="60" w:type="dxa"/>
-              <w:bottom w:w="60" w:type="dxa"/>
-              <w:left w:w="100" w:type="dxa"/>
-              <w:right w:w="100" w:type="dxa"/>
-            </w:tcMar>
-          </w:tcPr>
-          <w:p>
-            <w:r>
-              <w:rPr>
-                <w:rFonts w:ascii="Calibri" w:hAnsi="Calibri"/>
-                <w:color w:val="333333"/>
-                <w:sz w:val="17"/>
-              </w:rPr>
-              <w:t>Goroutine &amp; Channels</w:t>
-            </w:r>
-          </w:p>
-        </w:tc>
-        <w:tc>
-          <w:tcPr>
-            <w:tcW w:type="dxa" w:w="1872"/>
-            <w:shd w:fill="FFFFFF"/>
-            <w:tcMar>
-              <w:top w:w="60" w:type="dxa"/>
-              <w:bottom w:w="60" w:type="dxa"/>
-              <w:left w:w="100" w:type="dxa"/>
-              <w:right w:w="100" w:type="dxa"/>
-            </w:tcMar>
-          </w:tcPr>
-          <w:p>
-            <w:r>
-              <w:rPr>
-                <w:rFonts w:ascii="Calibri" w:hAnsi="Calibri"/>
-                <w:color w:val="333333"/>
-                <w:sz w:val="17"/>
-              </w:rPr>
-              <w:t>async / await, Task, Channel&lt;T&gt;</w:t>
-            </w:r>
-          </w:p>
-        </w:tc>
-        <w:tc>
-          <w:tcPr>
-            <w:tcW w:type="dxa" w:w="4608"/>
-            <w:shd w:fill="FFFFFF"/>
-            <w:tcMar>
-              <w:top w:w="60" w:type="dxa"/>
-              <w:bottom w:w="60" w:type="dxa"/>
-              <w:left w:w="100" w:type="dxa"/>
-              <w:right w:w="100" w:type="dxa"/>
-            </w:tcMar>
-          </w:tcPr>
-          <w:p>
-            <w:r>
-              <w:rPr>
-                <w:rFonts w:ascii="Calibri" w:hAnsi="Calibri"/>
-                <w:color w:val="333333"/>
-                <w:sz w:val="17"/>
-              </w:rPr>
-              <w:t>C# menggunakan ThreadPool terkelola. Tidak blocking thread OS.</w:t>
-            </w:r>
-          </w:p>
-        </w:tc>
-      </w:tr>
-      <w:tr>
-        <w:tc>
-          <w:tcPr>
-            <w:tcW w:type="dxa" w:w="1584"/>
-            <w:shd w:fill="F8FAFC"/>
-            <w:tcMar>
-              <w:top w:w="60" w:type="dxa"/>
-              <w:bottom w:w="60" w:type="dxa"/>
-              <w:left w:w="100" w:type="dxa"/>
-              <w:right w:w="100" w:type="dxa"/>
-            </w:tcMar>
-          </w:tcPr>
-          <w:p>
-            <w:r>
-              <w:rPr>
-                <w:rFonts w:ascii="Calibri" w:hAnsi="Calibri"/>
-                <w:color w:val="333333"/>
-                <w:sz w:val="17"/>
-              </w:rPr>
-              <w:t>Data Model</w:t>
-            </w:r>
-          </w:p>
-        </w:tc>
-        <w:tc>
-          <w:tcPr>
-            <w:tcW w:type="dxa" w:w="1728"/>
-            <w:shd w:fill="F8FAFC"/>
-            <w:tcMar>
-              <w:top w:w="60" w:type="dxa"/>
-              <w:bottom w:w="60" w:type="dxa"/>
-              <w:left w:w="100" w:type="dxa"/>
-              <w:right w:w="100" w:type="dxa"/>
-            </w:tcMar>
-          </w:tcPr>
-          <w:p>
-            <w:r>
-              <w:rPr>
-                <w:rFonts w:ascii="Calibri" w:hAnsi="Calibri"/>
-                <w:color w:val="333333"/>
-                <w:sz w:val="17"/>
-              </w:rPr>
-              <w:t>struct &amp; interface</w:t>
-            </w:r>
-          </w:p>
-        </w:tc>
-        <w:tc>
-          <w:tcPr>
-            <w:tcW w:type="dxa" w:w="1872"/>
-            <w:shd w:fill="F8FAFC"/>
-            <w:tcMar>
-              <w:top w:w="60" w:type="dxa"/>
-              <w:bottom w:w="60" w:type="dxa"/>
-              <w:left w:w="100" w:type="dxa"/>
-              <w:right w:w="100" w:type="dxa"/>
-            </w:tcMar>
-          </w:tcPr>
-          <w:p>
-            <w:r>
-              <w:rPr>
-                <w:rFonts w:ascii="Calibri" w:hAnsi="Calibri"/>
-                <w:color w:val="333333"/>
-                <w:sz w:val="17"/>
-              </w:rPr>
-              <w:t>record, class, interface</w:t>
-            </w:r>
-          </w:p>
-        </w:tc>
-        <w:tc>
-          <w:tcPr>
-            <w:tcW w:type="dxa" w:w="4608"/>
-            <w:shd w:fill="F8FAFC"/>
-            <w:tcMar>
-              <w:top w:w="60" w:type="dxa"/>
-              <w:bottom w:w="60" w:type="dxa"/>
-              <w:left w:w="100" w:type="dxa"/>
-              <w:right w:w="100" w:type="dxa"/>
-            </w:tcMar>
-          </w:tcPr>
-          <w:p>
-            <w:r>
-              <w:rPr>
-                <w:rFonts w:ascii="Calibri" w:hAnsi="Calibri"/>
-                <w:color w:val="333333"/>
-                <w:sz w:val="17"/>
-              </w:rPr>
-              <w:t>C# record memberikan immutability dan value-equality otomatis.</w:t>
-            </w:r>
-          </w:p>
-        </w:tc>
-      </w:tr>
-      <w:tr>
-        <w:tc>
-          <w:tcPr>
-            <w:tcW w:type="dxa" w:w="1584"/>
-            <w:shd w:fill="FFFFFF"/>
-            <w:tcMar>
-              <w:top w:w="60" w:type="dxa"/>
-              <w:bottom w:w="60" w:type="dxa"/>
-              <w:left w:w="100" w:type="dxa"/>
-              <w:right w:w="100" w:type="dxa"/>
-            </w:tcMar>
-          </w:tcPr>
-          <w:p>
-            <w:r>
-              <w:rPr>
-                <w:rFonts w:ascii="Calibri" w:hAnsi="Calibri"/>
-                <w:color w:val="333333"/>
-                <w:sz w:val="17"/>
-              </w:rPr>
-              <w:t>Database Access</w:t>
-            </w:r>
-          </w:p>
-        </w:tc>
-        <w:tc>
-          <w:tcPr>
-            <w:tcW w:type="dxa" w:w="1728"/>
-            <w:shd w:fill="FFFFFF"/>
-            <w:tcMar>
-              <w:top w:w="60" w:type="dxa"/>
-              <w:bottom w:w="60" w:type="dxa"/>
-              <w:left w:w="100" w:type="dxa"/>
-              <w:right w:w="100" w:type="dxa"/>
-            </w:tcMar>
-          </w:tcPr>
-          <w:p>
-            <w:r>
-              <w:rPr>
-                <w:rFonts w:ascii="Calibri" w:hAnsi="Calibri"/>
-                <w:color w:val="333333"/>
-                <w:sz w:val="17"/>
-              </w:rPr>
-              <w:t>pgx (Raw SQL) / GORM</w:t>
-            </w:r>
-          </w:p>
-        </w:tc>
-        <w:tc>
-          <w:tcPr>
-            <w:tcW w:type="dxa" w:w="1872"/>
-            <w:shd w:fill="FFFFFF"/>
-            <w:tcMar>
-              <w:top w:w="60" w:type="dxa"/>
-              <w:bottom w:w="60" w:type="dxa"/>
-              <w:left w:w="100" w:type="dxa"/>
-              <w:right w:w="100" w:type="dxa"/>
-            </w:tcMar>
-          </w:tcPr>
-          <w:p>
-            <w:r>
-              <w:rPr>
-                <w:rFonts w:ascii="Calibri" w:hAnsi="Calibri"/>
-                <w:color w:val="333333"/>
-                <w:sz w:val="17"/>
-              </w:rPr>
-              <w:t>EF Core / Dapper</w:t>
-            </w:r>
-          </w:p>
-        </w:tc>
-        <w:tc>
-          <w:tcPr>
-            <w:tcW w:type="dxa" w:w="4608"/>
-            <w:shd w:fill="FFFFFF"/>
-            <w:tcMar>
-              <w:top w:w="60" w:type="dxa"/>
-              <w:bottom w:w="60" w:type="dxa"/>
-              <w:left w:w="100" w:type="dxa"/>
-              <w:right w:w="100" w:type="dxa"/>
-            </w:tcMar>
-          </w:tcPr>
-          <w:p>
-            <w:r>
-              <w:rPr>
-                <w:rFonts w:ascii="Calibri" w:hAnsi="Calibri"/>
-                <w:color w:val="333333"/>
-                <w:sz w:val="17"/>
-              </w:rPr>
-              <w:t>Dapper setara dengan raw SQL berkecepatan tinggi; EF Core adalah ORM enterprise.</w:t>
-            </w:r>
-          </w:p>
-        </w:tc>
-      </w:tr>
-      <w:tr>
-        <w:tc>
-          <w:tcPr>
-            <w:tcW w:type="dxa" w:w="1584"/>
-            <w:shd w:fill="F8FAFC"/>
-            <w:tcMar>
-              <w:top w:w="60" w:type="dxa"/>
-              <w:bottom w:w="60" w:type="dxa"/>
-              <w:left w:w="100" w:type="dxa"/>
-              <w:right w:w="100" w:type="dxa"/>
-            </w:tcMar>
-          </w:tcPr>
-          <w:p>
-            <w:r>
-              <w:rPr>
-                <w:rFonts w:ascii="Calibri" w:hAnsi="Calibri"/>
-                <w:color w:val="333333"/>
-                <w:sz w:val="17"/>
-              </w:rPr>
-              <w:t>Dependency Injection</w:t>
-            </w:r>
-          </w:p>
-        </w:tc>
-        <w:tc>
-          <w:tcPr>
-            <w:tcW w:type="dxa" w:w="1728"/>
-            <w:shd w:fill="F8FAFC"/>
-            <w:tcMar>
-              <w:top w:w="60" w:type="dxa"/>
-              <w:bottom w:w="60" w:type="dxa"/>
-              <w:left w:w="100" w:type="dxa"/>
-              <w:right w:w="100" w:type="dxa"/>
-            </w:tcMar>
-          </w:tcPr>
-          <w:p>
-            <w:r>
-              <w:rPr>
-                <w:rFonts w:ascii="Calibri" w:hAnsi="Calibri"/>
-                <w:color w:val="333333"/>
-                <w:sz w:val="17"/>
-              </w:rPr>
-              <w:t>Manual wire / wire.go</w:t>
-            </w:r>
-          </w:p>
-        </w:tc>
-        <w:tc>
-          <w:tcPr>
-            <w:tcW w:type="dxa" w:w="1872"/>
-            <w:shd w:fill="F8FAFC"/>
-            <w:tcMar>
-              <w:top w:w="60" w:type="dxa"/>
-              <w:bottom w:w="60" w:type="dxa"/>
-              <w:left w:w="100" w:type="dxa"/>
-              <w:right w:w="100" w:type="dxa"/>
-            </w:tcMar>
-          </w:tcPr>
-          <w:p>
-            <w:r>
-              <w:rPr>
-                <w:rFonts w:ascii="Calibri" w:hAnsi="Calibri"/>
-                <w:color w:val="333333"/>
-                <w:sz w:val="17"/>
-              </w:rPr>
-              <w:t>Microsoft.Extensions.DependencyInjection</w:t>
-            </w:r>
-          </w:p>
-        </w:tc>
-        <w:tc>
-          <w:tcPr>
-            <w:tcW w:type="dxa" w:w="4608"/>
-            <w:shd w:fill="F8FAFC"/>
-            <w:tcMar>
-              <w:top w:w="60" w:type="dxa"/>
-              <w:bottom w:w="60" w:type="dxa"/>
-              <w:left w:w="100" w:type="dxa"/>
-              <w:right w:w="100" w:type="dxa"/>
-            </w:tcMar>
-          </w:tcPr>
-          <w:p>
-            <w:r>
-              <w:rPr>
-                <w:rFonts w:ascii="Calibri" w:hAnsi="Calibri"/>
-                <w:color w:val="333333"/>
-                <w:sz w:val="17"/>
-              </w:rPr>
-              <w:t>Built-in ke ASP.NET Core via IServiceCollection (Scoped, Transient, Singleton).</w:t>
-            </w:r>
-          </w:p>
-        </w:tc>
-      </w:tr>
-      <w:tr>
-        <w:tc>
-          <w:tcPr>
-            <w:tcW w:type="dxa" w:w="1584"/>
-            <w:shd w:fill="FFFFFF"/>
-            <w:tcMar>
-              <w:top w:w="60" w:type="dxa"/>
-              <w:bottom w:w="60" w:type="dxa"/>
-              <w:left w:w="100" w:type="dxa"/>
-              <w:right w:w="100" w:type="dxa"/>
-            </w:tcMar>
-          </w:tcPr>
-          <w:p>
-            <w:r>
-              <w:rPr>
-                <w:rFonts w:ascii="Calibri" w:hAnsi="Calibri"/>
-                <w:color w:val="333333"/>
-                <w:sz w:val="17"/>
-              </w:rPr>
-              <w:t>Cancellation</w:t>
-            </w:r>
-          </w:p>
-        </w:tc>
-        <w:tc>
-          <w:tcPr>
-            <w:tcW w:type="dxa" w:w="1728"/>
-            <w:shd w:fill="FFFFFF"/>
-            <w:tcMar>
-              <w:top w:w="60" w:type="dxa"/>
-              <w:bottom w:w="60" w:type="dxa"/>
-              <w:left w:w="100" w:type="dxa"/>
-              <w:right w:w="100" w:type="dxa"/>
-            </w:tcMar>
-          </w:tcPr>
-          <w:p>
-            <w:r>
-              <w:rPr>
-                <w:rFonts w:ascii="Calibri" w:hAnsi="Calibri"/>
-                <w:color w:val="333333"/>
-                <w:sz w:val="17"/>
-              </w:rPr>
-              <w:t>ctx context.Context</w:t>
-            </w:r>
-          </w:p>
-        </w:tc>
-        <w:tc>
-          <w:tcPr>
-            <w:tcW w:type="dxa" w:w="1872"/>
-            <w:shd w:fill="FFFFFF"/>
-            <w:tcMar>
-              <w:top w:w="60" w:type="dxa"/>
-              <w:bottom w:w="60" w:type="dxa"/>
-              <w:left w:w="100" w:type="dxa"/>
-              <w:right w:w="100" w:type="dxa"/>
-            </w:tcMar>
-          </w:tcPr>
-          <w:p>
-            <w:r>
-              <w:rPr>
-                <w:rFonts w:ascii="Calibri" w:hAnsi="Calibri"/>
-                <w:color w:val="333333"/>
-                <w:sz w:val="17"/>
-              </w:rPr>
-              <w:t>CancellationToken ct</w:t>
-            </w:r>
-          </w:p>
-        </w:tc>
-        <w:tc>
-          <w:tcPr>
-            <w:tcW w:type="dxa" w:w="4608"/>
-            <w:shd w:fill="FFFFFF"/>
-            <w:tcMar>
-              <w:top w:w="60" w:type="dxa"/>
-              <w:bottom w:w="60" w:type="dxa"/>
-              <w:left w:w="100" w:type="dxa"/>
-              <w:right w:w="100" w:type="dxa"/>
-            </w:tcMar>
-          </w:tcPr>
-          <w:p>
-            <w:r>
-              <w:rPr>
-                <w:rFonts w:ascii="Calibri" w:hAnsi="Calibri"/>
-                <w:color w:val="333333"/>
-                <w:sz w:val="17"/>
-              </w:rPr>
-              <w:t>Wajib di-pass ke semua method async (I/O, database, HTTP client).</w:t>
-            </w:r>
-          </w:p>
-        </w:tc>
-      </w:tr>
-      <w:tr>
-        <w:tc>
-          <w:tcPr>
-            <w:tcW w:type="dxa" w:w="1584"/>
-            <w:shd w:fill="F8FAFC"/>
-            <w:tcMar>
-              <w:top w:w="60" w:type="dxa"/>
-              <w:bottom w:w="60" w:type="dxa"/>
-              <w:left w:w="100" w:type="dxa"/>
-              <w:right w:w="100" w:type="dxa"/>
-            </w:tcMar>
-          </w:tcPr>
-          <w:p>
-            <w:r>
-              <w:rPr>
-                <w:rFonts w:ascii="Calibri" w:hAnsi="Calibri"/>
-                <w:color w:val="333333"/>
-                <w:sz w:val="17"/>
-              </w:rPr>
-              <w:t>Pipeline Middleware</w:t>
-            </w:r>
-          </w:p>
-        </w:tc>
-        <w:tc>
-          <w:tcPr>
-            <w:tcW w:type="dxa" w:w="1728"/>
-            <w:shd w:fill="F8FAFC"/>
-            <w:tcMar>
-              <w:top w:w="60" w:type="dxa"/>
-              <w:bottom w:w="60" w:type="dxa"/>
-              <w:left w:w="100" w:type="dxa"/>
-              <w:right w:w="100" w:type="dxa"/>
-            </w:tcMar>
-          </w:tcPr>
-          <w:p>
-            <w:r>
-              <w:rPr>
-                <w:rFonts w:ascii="Calibri" w:hAnsi="Calibri"/>
-                <w:color w:val="333333"/>
-                <w:sz w:val="17"/>
-              </w:rPr>
-              <w:t>net/http middleware</w:t>
-            </w:r>
-          </w:p>
-        </w:tc>
-        <w:tc>
-          <w:tcPr>
-            <w:tcW w:type="dxa" w:w="1872"/>
-            <w:shd w:fill="F8FAFC"/>
-            <w:tcMar>
-              <w:top w:w="60" w:type="dxa"/>
-              <w:bottom w:w="60" w:type="dxa"/>
-              <w:left w:w="100" w:type="dxa"/>
-              <w:right w:w="100" w:type="dxa"/>
-            </w:tcMar>
-          </w:tcPr>
-          <w:p>
-            <w:r>
-              <w:rPr>
-                <w:rFonts w:ascii="Calibri" w:hAnsi="Calibri"/>
-                <w:color w:val="333333"/>
-                <w:sz w:val="17"/>
-              </w:rPr>
-              <w:t>ASP.NET Core Middleware Pipeline</w:t>
-            </w:r>
-          </w:p>
-        </w:tc>
-        <w:tc>
-          <w:tcPr>
-            <w:tcW w:type="dxa" w:w="4608"/>
-            <w:shd w:fill="F8FAFC"/>
-            <w:tcMar>
-              <w:top w:w="60" w:type="dxa"/>
-              <w:bottom w:w="60" w:type="dxa"/>
-              <w:left w:w="100" w:type="dxa"/>
-              <w:right w:w="100" w:type="dxa"/>
-            </w:tcMar>
-          </w:tcPr>
-          <w:p>
-            <w:r>
-              <w:rPr>
-                <w:rFonts w:ascii="Calibri" w:hAnsi="Calibri"/>
-                <w:color w:val="333333"/>
-                <w:sz w:val="17"/>
-              </w:rPr>
-              <w:t>Mekanisme app.UseMiddleware&lt;T&gt;() untuk audit, auth, exception handler.</w:t>
-            </w:r>
-          </w:p>
-        </w:tc>
-      </w:tr>
-    </w:tbl>
-    <w:p>
-      <w:pPr>
-        <w:spacing w:after="60"/>
-      </w:pPr>
-    </w:p>
-    <w:p>
-      <w:pPr>
-        <w:pStyle w:val="Heading2"/>
-        <w:keepNext/>
-        <w:spacing w:before="200" w:after="60"/>
-      </w:pPr>
-      <w:r>
-        <w:rPr>
-          <w:rFonts w:ascii="Calibri" w:hAnsi="Calibri"/>
-          <w:color w:val="334155"/>
-          <w:sz w:val="25"/>
-        </w:rPr>
-        <w:t>B. Pola Arsitektur Enterprise di .NET (Clean Architecture &amp; CQRS)</w:t>
-      </w:r>
-    </w:p>
-    <w:p>
-      <w:pPr>
-        <w:spacing w:before="0" w:after="60" w:line="276" w:lineRule="auto"/>
-      </w:pPr>
-      <w:r>
-        <w:rPr>
-          <w:rFonts w:ascii="Calibri" w:hAnsi="Calibri"/>
-          <w:i w:val="0"/>
-          <w:color w:val="333333"/>
-          <w:sz w:val="20"/>
-        </w:rPr>
-        <w:t>Proyek backend .NET enterprise modern memisahkan kode ke dalam 4 layer utama menggunakan pola CQRS (Command Query Responsibility Segregation) bersama MediatR:</w:t>
+        <w:t>A. Cakupan Fitur MiniFMS</w:t>
       </w:r>
     </w:p>
     <w:p>
@@ -1985,7 +1306,7 @@
           <w:color w:val="1E1E1E"/>
           <w:sz w:val="20"/>
         </w:rPr>
-        <w:t xml:space="preserve">Domain Layer: </w:t>
+        <w:t xml:space="preserve">1. Shipment Management: </w:t>
       </w:r>
       <w:r>
         <w:rPr>
@@ -1993,7 +1314,7 @@
           <w:color w:val="333333"/>
           <w:sz w:val="20"/>
         </w:rPr>
-        <w:t>Pure C# tanpa dependensi luar. Berisi Entities, Value Objects, Domain Events, dan Enums status shipment.</w:t>
+        <w:t>Create booking shipment, generate House B/L number, dan simpan ke PostgreSQL via EF Core.</w:t>
       </w:r>
     </w:p>
     <w:p>
@@ -2008,7 +1329,7 @@
           <w:color w:val="1E1E1E"/>
           <w:sz w:val="20"/>
         </w:rPr>
-        <w:t xml:space="preserve">Application Layer: </w:t>
+        <w:t xml:space="preserve">2. Finite State Machine: </w:t>
       </w:r>
       <w:r>
         <w:rPr>
@@ -2016,7 +1337,7 @@
           <w:color w:val="333333"/>
           <w:sz w:val="20"/>
         </w:rPr>
-        <w:t>Berisi use cases, MediatR Commands/Queries, DTOs, dan interface (IRepository, ICargoWiseService).</w:t>
+        <w:t>Endpoint update status shipment dengan validasi transisi bisnis yang ketat (misal: Draft tidak boleh langsung loncat ke Delivered).</w:t>
       </w:r>
     </w:p>
     <w:p>
@@ -2031,7 +1352,7 @@
           <w:color w:val="1E1E1E"/>
           <w:sz w:val="20"/>
         </w:rPr>
-        <w:t xml:space="preserve">Infrastructure Layer: </w:t>
+        <w:t xml:space="preserve">3. Webhook Milestone Ingestion (Idempotent): </w:t>
       </w:r>
       <w:r>
         <w:rPr>
@@ -2039,7 +1360,36 @@
           <w:color w:val="333333"/>
           <w:sz w:val="20"/>
         </w:rPr>
-        <w:t>Implementasi EF Core DbContext, Dapper queries, client HTTP eAdaptor, Azure Service Bus / RabbitMQ consumer.</w:t>
+        <w:t>Endpoint POST menerima status update kontainer dengan proteksi Redis untuk mencegah duplikasi event.</w:t>
+      </w:r>
+    </w:p>
+    <w:p>
+      <w:pPr>
+        <w:pStyle w:val="Heading2"/>
+        <w:keepNext/>
+        <w:spacing w:before="200" w:after="60"/>
+      </w:pPr>
+      <w:r>
+        <w:rPr>
+          <w:rFonts w:ascii="Calibri" w:hAnsi="Calibri"/>
+          <w:color w:val="334155"/>
+          <w:sz w:val="25"/>
+        </w:rPr>
+        <w:t>B. Step-by-Step Pembuatan MiniFMS</w:t>
+      </w:r>
+    </w:p>
+    <w:p>
+      <w:pPr>
+        <w:spacing w:before="0" w:after="60" w:line="276" w:lineRule="auto"/>
+      </w:pPr>
+      <w:r>
+        <w:rPr>
+          <w:rFonts w:ascii="Calibri" w:hAnsi="Calibri"/>
+          <w:i w:val="0"/>
+          <w:color w:val="333333"/>
+          <w:sz w:val="20"/>
+        </w:rPr>
+        <w:t>Ikuti urutan langkah berikut saat mulai membuat project besok:</w:t>
       </w:r>
     </w:p>
     <w:p>
@@ -2054,7 +1404,7 @@
           <w:color w:val="1E1E1E"/>
           <w:sz w:val="20"/>
         </w:rPr>
-        <w:t xml:space="preserve">API / Presentation Layer: </w:t>
+        <w:t xml:space="preserve">Langkah 1 (Project Setup): </w:t>
       </w:r>
       <w:r>
         <w:rPr>
@@ -2062,36 +1412,7 @@
           <w:color w:val="333333"/>
           <w:sz w:val="20"/>
         </w:rPr>
-        <w:t>ASP.NET Core Controllers atau Minimal APIs, filter validasi, swagger documentation.</w:t>
-      </w:r>
-    </w:p>
-    <w:p>
-      <w:pPr>
-        <w:pStyle w:val="Heading2"/>
-        <w:keepNext/>
-        <w:spacing w:before="200" w:after="60"/>
-      </w:pPr>
-      <w:r>
-        <w:rPr>
-          <w:rFonts w:ascii="Calibri" w:hAnsi="Calibri"/>
-          <w:color w:val="334155"/>
-          <w:sz w:val="25"/>
-        </w:rPr>
-        <w:t>C. Message Broker &amp; Resiliency (MassTransit &amp; Polly)</w:t>
-      </w:r>
-    </w:p>
-    <w:p>
-      <w:pPr>
-        <w:spacing w:before="0" w:after="60" w:line="276" w:lineRule="auto"/>
-      </w:pPr>
-      <w:r>
-        <w:rPr>
-          <w:rFonts w:ascii="Calibri" w:hAnsi="Calibri"/>
-          <w:i w:val="0"/>
-          <w:color w:val="333333"/>
-          <w:sz w:val="20"/>
-        </w:rPr>
-        <w:t>Untuk menangani webhook tracking logistik yang bervolume tinggi, .NET menggunakan MassTransit dan Polly:</w:t>
+        <w:t>Inisialisasi solution ASP.NET Core Web API .NET 8, tambahkan package EntityFrameworkCore.PostgreSQL, Dapper, dan StackExchange.Redis.</w:t>
       </w:r>
     </w:p>
     <w:p>
@@ -2106,7 +1427,7 @@
           <w:color w:val="1E1E1E"/>
           <w:sz w:val="20"/>
         </w:rPr>
-        <w:t xml:space="preserve">MassTransit: </w:t>
+        <w:t xml:space="preserve">Langkah 2 (Domain &amp; Database): </w:t>
       </w:r>
       <w:r>
         <w:rPr>
@@ -2114,7 +1435,7 @@
           <w:color w:val="333333"/>
           <w:sz w:val="20"/>
         </w:rPr>
-        <w:t>Abstraksi message bus enterprise untuk Azure Service Bus atau RabbitMQ yang mendukung Transactional Outbox Pattern (menjamin pesan event terkirim meski database terputus).</w:t>
+        <w:t>Buat entitas Shipment dengan property ID, BookingNumber, HouseBillOfLading, Status (enum), dan CreatedAt. Buat DbContext dan jalankan dotnet ef migrations add Initial.</w:t>
       </w:r>
     </w:p>
     <w:p>
@@ -2129,7 +1450,7 @@
           <w:color w:val="1E1E1E"/>
           <w:sz w:val="20"/>
         </w:rPr>
-        <w:t xml:space="preserve">Polly: </w:t>
+        <w:t xml:space="preserve">Langkah 3 (State Machine Logic): </w:t>
       </w:r>
       <w:r>
         <w:rPr>
@@ -2137,830 +1458,54 @@
           <w:color w:val="333333"/>
           <w:sz w:val="20"/>
         </w:rPr>
-        <w:t>Pustaka resilience &amp; transient fault handling. Mengatur retry policy dengan exponential backoff dan circuit breaker saat menembak API pelayaran atau CargoWise.</w:t>
+        <w:t>Implementasikan method UpdateStatus pada entity Shipment dengan aturan switch pattern matching yang menolak transisi ilegal.</w:t>
       </w:r>
     </w:p>
     <w:p>
       <w:pPr>
-        <w:pStyle w:val="Heading1"/>
-        <w:keepNext/>
-        <w:spacing w:before="280" w:after="80"/>
+        <w:pStyle w:val="ListBullet"/>
+        <w:spacing w:before="0" w:after="40" w:line="276" w:lineRule="auto"/>
       </w:pPr>
       <w:r>
         <w:rPr>
           <w:rFonts w:ascii="Calibri" w:hAnsi="Calibri"/>
-          <w:color w:val="1E3A8A"/>
-          <w:sz w:val="30"/>
+          <w:b/>
+          <w:color w:val="1E1E1E"/>
+          <w:sz w:val="20"/>
         </w:rPr>
-        <w:t>6. Contoh Implementasi Kode Nyata dalam C#</w:t>
+        <w:t xml:space="preserve">Langkah 4 (API &amp; Idempotency): </w:t>
+      </w:r>
+      <w:r>
+        <w:rPr>
+          <w:rFonts w:ascii="Calibri" w:hAnsi="Calibri"/>
+          <w:color w:val="333333"/>
+          <w:sz w:val="20"/>
+        </w:rPr>
+        <w:t>Buat Controller untuk Create Shipment dan Ingest Milestone Webhook yang mengintegrasikan Redis StringSetAsync (NX) sebagai Idempotency Key.</w:t>
       </w:r>
     </w:p>
     <w:p>
       <w:pPr>
-        <w:pStyle w:val="Heading2"/>
-        <w:keepNext/>
-        <w:spacing w:before="200" w:after="60"/>
+        <w:pStyle w:val="ListBullet"/>
+        <w:spacing w:before="0" w:after="40" w:line="276" w:lineRule="auto"/>
       </w:pPr>
       <w:r>
         <w:rPr>
           <w:rFonts w:ascii="Calibri" w:hAnsi="Calibri"/>
-          <w:color w:val="334155"/>
-          <w:sz w:val="25"/>
+          <w:b/>
+          <w:color w:val="1E1E1E"/>
+          <w:sz w:val="20"/>
         </w:rPr>
-        <w:t>A. Implementasi Domain Entity &amp; Finite State Machine</w:t>
+        <w:t xml:space="preserve">Langkah 5 (Testing): </w:t>
       </w:r>
-    </w:p>
-    <w:p>
-      <w:pPr>
-        <w:spacing w:before="0" w:after="60" w:line="276" w:lineRule="auto"/>
-      </w:pPr>
       <w:r>
         <w:rPr>
           <w:rFonts w:ascii="Calibri" w:hAnsi="Calibri"/>
-          <w:i w:val="0"/>
           <w:color w:val="333333"/>
           <w:sz w:val="20"/>
         </w:rPr>
-        <w:t>Contoh implementasi entity shipment dengan validasi transisi status bisnis:</w:t>
+        <w:t>Tulis unit test menggunakan xUnit untuk memvalidasi aturan transisi State Machine.</w:t>
       </w:r>
-    </w:p>
-    <w:tbl>
-      <w:tblPr>
-        <w:tblW w:type="auto" w:w="0"/>
-        <w:jc w:val="center"/>
-        <w:tblLayout w:type="fixed"/>
-        <w:tblLook w:firstColumn="1" w:firstRow="1" w:lastColumn="0" w:lastRow="0" w:noHBand="0" w:noVBand="1" w:val="04A0"/>
-      </w:tblPr>
-      <w:tblGrid>
-        <w:gridCol w:w="9792"/>
-      </w:tblGrid>
-      <w:tr>
-        <w:tc>
-          <w:tcPr>
-            <w:tcW w:type="dxa" w:w="9936"/>
-            <w:shd w:fill="1E1E1E"/>
-            <w:tcMar>
-              <w:top w:w="100" w:type="dxa"/>
-              <w:bottom w:w="100" w:type="dxa"/>
-              <w:left w:w="140" w:type="dxa"/>
-              <w:right w:w="140" w:type="dxa"/>
-            </w:tcMar>
-          </w:tcPr>
-          <w:p>
-            <w:pPr>
-              <w:spacing w:before="40" w:after="40" w:line="252" w:lineRule="auto"/>
-            </w:pPr>
-            <w:r>
-              <w:rPr>
-                <w:rFonts w:ascii="Consolas" w:hAnsi="Consolas"/>
-                <w:color w:val="DCDCDC"/>
-                <w:sz w:val="17"/>
-              </w:rPr>
-              <w:t>public enum ShipmentStatus</w:t>
-              <w:br/>
-              <w:t>{</w:t>
-              <w:br/>
-              <w:t xml:space="preserve">    Draft,</w:t>
-              <w:br/>
-              <w:t xml:space="preserve">    BookingConfirmed,</w:t>
-              <w:br/>
-              <w:t xml:space="preserve">    GatedInOrigin,</w:t>
-              <w:br/>
-              <w:t xml:space="preserve">    LoadedOnVessel,</w:t>
-              <w:br/>
-              <w:t xml:space="preserve">    DepartedPol,</w:t>
-              <w:br/>
-              <w:t xml:space="preserve">    InTransit,</w:t>
-              <w:br/>
-              <w:t xml:space="preserve">    DischargedPod,</w:t>
-              <w:br/>
-              <w:t xml:space="preserve">    CustomsCleared,</w:t>
-              <w:br/>
-              <w:t xml:space="preserve">    Delivered</w:t>
-              <w:br/>
-              <w:t>}</w:t>
-              <w:br/>
-              <w:br/>
-              <w:t>public sealed class Shipment</w:t>
-              <w:br/>
-              <w:t>{</w:t>
-              <w:br/>
-              <w:t xml:space="preserve">    public Guid Id { get; private set; }</w:t>
-              <w:br/>
-              <w:t xml:space="preserve">    public string BookingNumber { get; private set; } = string.Empty;</w:t>
-              <w:br/>
-              <w:t xml:space="preserve">    public string? MasterBillOfLading { get; private set; }</w:t>
-              <w:br/>
-              <w:t xml:space="preserve">    public string? HouseBillOfLading { get; private set; }</w:t>
-              <w:br/>
-              <w:t xml:space="preserve">    public ShipmentStatus Status { get; private set; }</w:t>
-              <w:br/>
-              <w:t xml:space="preserve">    public DateTime CreatedAtUtc { get; private set; }</w:t>
-              <w:br/>
-              <w:br/>
-              <w:t xml:space="preserve">    // Domain validation state transition</w:t>
-              <w:br/>
-              <w:t xml:space="preserve">    public Result UpdateStatus(ShipmentStatus newStatus, DateTime eventTimeUtc)</w:t>
-              <w:br/>
-              <w:t xml:space="preserve">    {</w:t>
-              <w:br/>
-              <w:t xml:space="preserve">        bool isValidTransition = (Status, newStatus) switch</w:t>
-              <w:br/>
-              <w:t xml:space="preserve">        {</w:t>
-              <w:br/>
-              <w:t xml:space="preserve">            (ShipmentStatus.Draft, ShipmentStatus.BookingConfirmed) =&gt; true,</w:t>
-              <w:br/>
-              <w:t xml:space="preserve">            (ShipmentStatus.BookingConfirmed, ShipmentStatus.GatedInOrigin) =&gt; true,</w:t>
-              <w:br/>
-              <w:t xml:space="preserve">            (ShipmentStatus.GatedInOrigin, ShipmentStatus.LoadedOnVessel) =&gt; true,</w:t>
-              <w:br/>
-              <w:t xml:space="preserve">            (ShipmentStatus.LoadedOnVessel, ShipmentStatus.DepartedPol) =&gt; true,</w:t>
-              <w:br/>
-              <w:t xml:space="preserve">            (ShipmentStatus.DepartedPol, ShipmentStatus.InTransit) =&gt; true,</w:t>
-              <w:br/>
-              <w:t xml:space="preserve">            (ShipmentStatus.InTransit, ShipmentStatus.DischargedPod) =&gt; true,</w:t>
-              <w:br/>
-              <w:t xml:space="preserve">            (ShipmentStatus.DischargedPod, ShipmentStatus.CustomsCleared) =&gt; true,</w:t>
-              <w:br/>
-              <w:t xml:space="preserve">            (ShipmentStatus.CustomsCleared, ShipmentStatus.Delivered) =&gt; true,</w:t>
-              <w:br/>
-              <w:t xml:space="preserve">            _ =&gt; false</w:t>
-              <w:br/>
-              <w:t xml:space="preserve">        };</w:t>
-              <w:br/>
-              <w:br/>
-              <w:t xml:space="preserve">        if (!isValidTransition)</w:t>
-              <w:br/>
-              <w:t xml:space="preserve">            return Result.Failure($"Invalid transition from {Status} to {newStatus}");</w:t>
-              <w:br/>
-              <w:br/>
-              <w:t xml:space="preserve">        Status = newStatus;</w:t>
-              <w:br/>
-              <w:t xml:space="preserve">        return Result.Success();</w:t>
-              <w:br/>
-              <w:t xml:space="preserve">    }</w:t>
-              <w:br/>
-              <w:t>}</w:t>
-            </w:r>
-          </w:p>
-        </w:tc>
-      </w:tr>
-    </w:tbl>
-    <w:p>
-      <w:pPr>
-        <w:spacing w:after="80" w:before="0"/>
-      </w:pPr>
-    </w:p>
-    <w:p>
-      <w:pPr>
-        <w:pStyle w:val="Heading2"/>
-        <w:keepNext/>
-        <w:spacing w:before="200" w:after="60"/>
-      </w:pPr>
-      <w:r>
-        <w:rPr>
-          <w:rFonts w:ascii="Calibri" w:hAnsi="Calibri"/>
-          <w:color w:val="334155"/>
-          <w:sz w:val="25"/>
-        </w:rPr>
-        <w:t>B. Pola Idempotensi Webhook Ingestion di Controller ASP.NET Core</w:t>
-      </w:r>
-    </w:p>
-    <w:p>
-      <w:pPr>
-        <w:spacing w:before="0" w:after="60" w:line="276" w:lineRule="auto"/>
-      </w:pPr>
-      <w:r>
-        <w:rPr>
-          <w:rFonts w:ascii="Calibri" w:hAnsi="Calibri"/>
-          <w:i w:val="0"/>
-          <w:color w:val="333333"/>
-          <w:sz w:val="20"/>
-        </w:rPr>
-        <w:t>Penanganan webhook tracking dari pelayaran/CargoWise dengan pencegahan duplikasi data via Redis:</w:t>
-      </w:r>
-    </w:p>
-    <w:tbl>
-      <w:tblPr>
-        <w:tblW w:type="auto" w:w="0"/>
-        <w:jc w:val="center"/>
-        <w:tblLayout w:type="fixed"/>
-        <w:tblLook w:firstColumn="1" w:firstRow="1" w:lastColumn="0" w:lastRow="0" w:noHBand="0" w:noVBand="1" w:val="04A0"/>
-      </w:tblPr>
-      <w:tblGrid>
-        <w:gridCol w:w="9792"/>
-      </w:tblGrid>
-      <w:tr>
-        <w:tc>
-          <w:tcPr>
-            <w:tcW w:type="dxa" w:w="9936"/>
-            <w:shd w:fill="1E1E1E"/>
-            <w:tcMar>
-              <w:top w:w="100" w:type="dxa"/>
-              <w:bottom w:w="100" w:type="dxa"/>
-              <w:left w:w="140" w:type="dxa"/>
-              <w:right w:w="140" w:type="dxa"/>
-            </w:tcMar>
-          </w:tcPr>
-          <w:p>
-            <w:pPr>
-              <w:spacing w:before="40" w:after="40" w:line="252" w:lineRule="auto"/>
-            </w:pPr>
-            <w:r>
-              <w:rPr>
-                <w:rFonts w:ascii="Consolas" w:hAnsi="Consolas"/>
-                <w:color w:val="DCDCDC"/>
-                <w:sz w:val="17"/>
-              </w:rPr>
-              <w:t>[ApiController]</w:t>
-              <w:br/>
-              <w:t>[Route("api/v1/webhooks/tracking")]</w:t>
-              <w:br/>
-              <w:t>public class TrackingWebhookController : ControllerBase</w:t>
-              <w:br/>
-              <w:t>{</w:t>
-              <w:br/>
-              <w:t xml:space="preserve">    private readonly IConnectionMultiplexer _redis;</w:t>
-              <w:br/>
-              <w:t xml:space="preserve">    private readonly ISender _mediator;</w:t>
-              <w:br/>
-              <w:br/>
-              <w:t xml:space="preserve">    public TrackingWebhookController(IConnectionMultiplexer redis, ISender mediator)</w:t>
-              <w:br/>
-              <w:t xml:space="preserve">    {</w:t>
-              <w:br/>
-              <w:t xml:space="preserve">        _redis = redis;</w:t>
-              <w:br/>
-              <w:t xml:space="preserve">        _mediator = mediator;</w:t>
-              <w:br/>
-              <w:t xml:space="preserve">    }</w:t>
-              <w:br/>
-              <w:br/>
-              <w:t xml:space="preserve">    [HttpPost]</w:t>
-              <w:br/>
-              <w:t xml:space="preserve">    public async Task&lt;IActionResult&gt; IngestMilestone([FromBody] MilestoneWebhookDto dto, CancellationToken ct)</w:t>
-              <w:br/>
-              <w:t xml:space="preserve">    {</w:t>
-              <w:br/>
-              <w:t xml:space="preserve">        var db = _redis.GetDatabase();</w:t>
-              <w:br/>
-              <w:t xml:space="preserve">        string lockKey = $"lock:milestone:{dto.ContainerNumber}:{dto.MilestoneCode}";</w:t>
-              <w:br/>
-              <w:br/>
-              <w:t xml:space="preserve">        // Idempotency check: SetNX dengan TTL 24 jam</w:t>
-              <w:br/>
-              <w:t xml:space="preserve">        bool acquired = await db.StringSetAsync(lockKey, "PROCESSED", TimeSpan.FromHours(24), When.NotExists);</w:t>
-              <w:br/>
-              <w:t xml:space="preserve">        if (!acquired)</w:t>
-              <w:br/>
-              <w:t xml:space="preserve">        {</w:t>
-              <w:br/>
-              <w:t xml:space="preserve">            // Webhook sudah pernah diproses sebelumnya (Idempotent response)</w:t>
-              <w:br/>
-              <w:t xml:space="preserve">            return Ok(new { status = "IGNORED_DUPLICATE", eventId = dto.EventId });</w:t>
-              <w:br/>
-              <w:t xml:space="preserve">        }</w:t>
-              <w:br/>
-              <w:br/>
-              <w:t xml:space="preserve">        var command = new ProcessMilestoneCommand(dto.ContainerNumber, dto.MilestoneCode, dto.EventTimeUtc);</w:t>
-              <w:br/>
-              <w:t xml:space="preserve">        var result = await _mediator.Send(command, ct);</w:t>
-              <w:br/>
-              <w:br/>
-              <w:t xml:space="preserve">        return result.IsSuccess ? Ok(new { status = "PROCESSED" }) : BadRequest(result.Error);</w:t>
-              <w:br/>
-              <w:t xml:space="preserve">    }</w:t>
-              <w:br/>
-              <w:t>}</w:t>
-            </w:r>
-          </w:p>
-        </w:tc>
-      </w:tr>
-    </w:tbl>
-    <w:p>
-      <w:pPr>
-        <w:spacing w:after="80" w:before="0"/>
-      </w:pPr>
-    </w:p>
-    <w:p>
-      <w:pPr>
-        <w:pStyle w:val="Heading2"/>
-        <w:keepNext/>
-        <w:spacing w:before="200" w:after="60"/>
-      </w:pPr>
-      <w:r>
-        <w:rPr>
-          <w:rFonts w:ascii="Calibri" w:hAnsi="Calibri"/>
-          <w:color w:val="334155"/>
-          <w:sz w:val="25"/>
-        </w:rPr>
-        <w:t>C. Deserialisasi XML CargoWise eAdaptor UniversalShipment</w:t>
-      </w:r>
-    </w:p>
-    <w:p>
-      <w:pPr>
-        <w:spacing w:before="0" w:after="60" w:line="276" w:lineRule="auto"/>
-      </w:pPr>
-      <w:r>
-        <w:rPr>
-          <w:rFonts w:ascii="Calibri" w:hAnsi="Calibri"/>
-          <w:i w:val="0"/>
-          <w:color w:val="333333"/>
-          <w:sz w:val="20"/>
-        </w:rPr>
-        <w:t>Mengurai dokumen XML kompleks eAdaptor menggunakan XmlSerializer C#:</w:t>
-      </w:r>
-    </w:p>
-    <w:tbl>
-      <w:tblPr>
-        <w:tblW w:type="auto" w:w="0"/>
-        <w:jc w:val="center"/>
-        <w:tblLayout w:type="fixed"/>
-        <w:tblLook w:firstColumn="1" w:firstRow="1" w:lastColumn="0" w:lastRow="0" w:noHBand="0" w:noVBand="1" w:val="04A0"/>
-      </w:tblPr>
-      <w:tblGrid>
-        <w:gridCol w:w="9792"/>
-      </w:tblGrid>
-      <w:tr>
-        <w:tc>
-          <w:tcPr>
-            <w:tcW w:type="dxa" w:w="9936"/>
-            <w:shd w:fill="1E1E1E"/>
-            <w:tcMar>
-              <w:top w:w="100" w:type="dxa"/>
-              <w:bottom w:w="100" w:type="dxa"/>
-              <w:left w:w="140" w:type="dxa"/>
-              <w:right w:w="140" w:type="dxa"/>
-            </w:tcMar>
-          </w:tcPr>
-          <w:p>
-            <w:pPr>
-              <w:spacing w:before="40" w:after="40" w:line="252" w:lineRule="auto"/>
-            </w:pPr>
-            <w:r>
-              <w:rPr>
-                <w:rFonts w:ascii="Consolas" w:hAnsi="Consolas"/>
-                <w:color w:val="DCDCDC"/>
-                <w:sz w:val="17"/>
-              </w:rPr>
-              <w:t>[XmlRoot("UniversalShipment", Namespace = "http://www.cargowise.com/Schemas/Universal/2011/11")]</w:t>
-              <w:br/>
-              <w:t>public class UniversalShipmentXml</w:t>
-              <w:br/>
-              <w:t>{</w:t>
-              <w:br/>
-              <w:t xml:space="preserve">    [XmlElement("Shipment")]</w:t>
-              <w:br/>
-              <w:t xml:space="preserve">    public ShipmentData? Shipment { get; set; }</w:t>
-              <w:br/>
-              <w:t>}</w:t>
-              <w:br/>
-              <w:br/>
-              <w:t>public class ShipmentData</w:t>
-              <w:br/>
-              <w:t>{</w:t>
-              <w:br/>
-              <w:t xml:space="preserve">    [XmlElement("DataContext")]</w:t>
-              <w:br/>
-              <w:t xml:space="preserve">    public DataContextData? DataContext { get; set; }</w:t>
-              <w:br/>
-              <w:br/>
-              <w:t xml:space="preserve">    [XmlArray("ContainerCollection")]</w:t>
-              <w:br/>
-              <w:t xml:space="preserve">    [XmlArrayItem("Container")]</w:t>
-              <w:br/>
-              <w:t xml:space="preserve">    public List&lt;ContainerData&gt; Containers { get; set; } = new();</w:t>
-              <w:br/>
-              <w:t>}</w:t>
-              <w:br/>
-              <w:br/>
-              <w:t>public static class CargoWiseParser</w:t>
-              <w:br/>
-              <w:t>{</w:t>
-              <w:br/>
-              <w:t xml:space="preserve">    public static UniversalShipmentXml Parse(string rawXml)</w:t>
-              <w:br/>
-              <w:t xml:space="preserve">    {</w:t>
-              <w:br/>
-              <w:t xml:space="preserve">        var serializer = new XmlSerializer(typeof(UniversalShipmentXml));</w:t>
-              <w:br/>
-              <w:t xml:space="preserve">        using var reader = new StringReader(rawXml);</w:t>
-              <w:br/>
-              <w:t xml:space="preserve">        return (UniversalShipmentXml)serializer.Deserialize(reader)!;</w:t>
-              <w:br/>
-              <w:t xml:space="preserve">    }</w:t>
-              <w:br/>
-              <w:t>}</w:t>
-            </w:r>
-          </w:p>
-        </w:tc>
-      </w:tr>
-    </w:tbl>
-    <w:p>
-      <w:pPr>
-        <w:spacing w:after="80" w:before="0"/>
-      </w:pPr>
-    </w:p>
-    <w:p>
-      <w:pPr>
-        <w:pStyle w:val="Heading1"/>
-        <w:keepNext/>
-        <w:spacing w:before="280" w:after="80"/>
-      </w:pPr>
-      <w:r>
-        <w:rPr>
-          <w:rFonts w:ascii="Calibri" w:hAnsi="Calibri"/>
-          <w:color w:val="1E3A8A"/>
-          <w:sz w:val="30"/>
-        </w:rPr>
-        <w:t>7. Action Plan 30 Hari Pertama di OneByOne Logistical</w:t>
-      </w:r>
-    </w:p>
-    <w:tbl>
-      <w:tblPr>
-        <w:tblW w:type="auto" w:w="0"/>
-        <w:jc w:val="center"/>
-        <w:tblLayout w:type="fixed"/>
-        <w:tblLook w:firstColumn="1" w:firstRow="1" w:lastColumn="0" w:lastRow="0" w:noHBand="0" w:noVBand="1" w:val="04A0"/>
-      </w:tblPr>
-      <w:tblGrid>
-        <w:gridCol w:w="3312"/>
-        <w:gridCol w:w="3312"/>
-        <w:gridCol w:w="3312"/>
-      </w:tblGrid>
-      <w:tr>
-        <w:tc>
-          <w:tcPr>
-            <w:tcW w:type="dxa" w:w="1584"/>
-            <w:shd w:fill="1E3A8A"/>
-            <w:tcMar>
-              <w:top w:w="80" w:type="dxa"/>
-              <w:bottom w:w="80" w:type="dxa"/>
-              <w:left w:w="100" w:type="dxa"/>
-              <w:right w:w="100" w:type="dxa"/>
-            </w:tcMar>
-          </w:tcPr>
-          <w:p>
-            <w:pPr>
-              <w:jc w:val="center"/>
-            </w:pPr>
-            <w:r>
-              <w:rPr>
-                <w:rFonts w:ascii="Calibri" w:hAnsi="Calibri"/>
-                <w:b/>
-                <w:color w:val="FFFFFF"/>
-                <w:sz w:val="18"/>
-              </w:rPr>
-              <w:t>Fase</w:t>
-            </w:r>
-          </w:p>
-        </w:tc>
-        <w:tc>
-          <w:tcPr>
-            <w:tcW w:type="dxa" w:w="2592"/>
-            <w:shd w:fill="1E3A8A"/>
-            <w:tcMar>
-              <w:top w:w="80" w:type="dxa"/>
-              <w:bottom w:w="80" w:type="dxa"/>
-              <w:left w:w="100" w:type="dxa"/>
-              <w:right w:w="100" w:type="dxa"/>
-            </w:tcMar>
-          </w:tcPr>
-          <w:p>
-            <w:pPr>
-              <w:jc w:val="center"/>
-            </w:pPr>
-            <w:r>
-              <w:rPr>
-                <w:rFonts w:ascii="Calibri" w:hAnsi="Calibri"/>
-                <w:b/>
-                <w:color w:val="FFFFFF"/>
-                <w:sz w:val="18"/>
-              </w:rPr>
-              <w:t>Target Teknis</w:t>
-            </w:r>
-          </w:p>
-        </w:tc>
-        <w:tc>
-          <w:tcPr>
-            <w:tcW w:type="dxa" w:w="5616"/>
-            <w:shd w:fill="1E3A8A"/>
-            <w:tcMar>
-              <w:top w:w="80" w:type="dxa"/>
-              <w:bottom w:w="80" w:type="dxa"/>
-              <w:left w:w="100" w:type="dxa"/>
-              <w:right w:w="100" w:type="dxa"/>
-            </w:tcMar>
-          </w:tcPr>
-          <w:p>
-            <w:pPr>
-              <w:jc w:val="center"/>
-            </w:pPr>
-            <w:r>
-              <w:rPr>
-                <w:rFonts w:ascii="Calibri" w:hAnsi="Calibri"/>
-                <w:b/>
-                <w:color w:val="FFFFFF"/>
-                <w:sz w:val="18"/>
-              </w:rPr>
-              <w:t>Langkah Aksi Konkret</w:t>
-            </w:r>
-          </w:p>
-        </w:tc>
-      </w:tr>
-      <w:tr>
-        <w:tc>
-          <w:tcPr>
-            <w:tcW w:type="dxa" w:w="1584"/>
-            <w:shd w:fill="FFFFFF"/>
-            <w:tcMar>
-              <w:top w:w="60" w:type="dxa"/>
-              <w:bottom w:w="60" w:type="dxa"/>
-              <w:left w:w="100" w:type="dxa"/>
-              <w:right w:w="100" w:type="dxa"/>
-            </w:tcMar>
-          </w:tcPr>
-          <w:p>
-            <w:r>
-              <w:rPr>
-                <w:rFonts w:ascii="Calibri" w:hAnsi="Calibri"/>
-                <w:color w:val="333333"/>
-                <w:sz w:val="17"/>
-              </w:rPr>
-              <w:t>Minggu 1</w:t>
-            </w:r>
-          </w:p>
-        </w:tc>
-        <w:tc>
-          <w:tcPr>
-            <w:tcW w:type="dxa" w:w="2592"/>
-            <w:shd w:fill="FFFFFF"/>
-            <w:tcMar>
-              <w:top w:w="60" w:type="dxa"/>
-              <w:bottom w:w="60" w:type="dxa"/>
-              <w:left w:w="100" w:type="dxa"/>
-              <w:right w:w="100" w:type="dxa"/>
-            </w:tcMar>
-          </w:tcPr>
-          <w:p>
-            <w:r>
-              <w:rPr>
-                <w:rFonts w:ascii="Calibri" w:hAnsi="Calibri"/>
-                <w:color w:val="333333"/>
-                <w:sz w:val="17"/>
-              </w:rPr>
-              <w:t>Arsitektur &amp; Setup Lokal</w:t>
-            </w:r>
-          </w:p>
-        </w:tc>
-        <w:tc>
-          <w:tcPr>
-            <w:tcW w:type="dxa" w:w="5616"/>
-            <w:shd w:fill="FFFFFF"/>
-            <w:tcMar>
-              <w:top w:w="60" w:type="dxa"/>
-              <w:bottom w:w="60" w:type="dxa"/>
-              <w:left w:w="100" w:type="dxa"/>
-              <w:right w:w="100" w:type="dxa"/>
-            </w:tcMar>
-          </w:tcPr>
-          <w:p>
-            <w:r>
-              <w:rPr>
-                <w:rFonts w:ascii="Calibri" w:hAnsi="Calibri"/>
-                <w:color w:val="333333"/>
-                <w:sz w:val="17"/>
-              </w:rPr>
-              <w:t>1. Clone repo, setup .NET 8 SDK, jalankan dotnet test &amp; docker-compose.</w:t>
-              <w:br/>
-              <w:t>2. Pelajari ERD database di SQL Server / Postgres.</w:t>
-              <w:br/>
-              <w:t>3. Pahami dependency injection di Program.cs.</w:t>
-            </w:r>
-          </w:p>
-        </w:tc>
-      </w:tr>
-      <w:tr>
-        <w:tc>
-          <w:tcPr>
-            <w:tcW w:type="dxa" w:w="1584"/>
-            <w:shd w:fill="F8FAFC"/>
-            <w:tcMar>
-              <w:top w:w="60" w:type="dxa"/>
-              <w:bottom w:w="60" w:type="dxa"/>
-              <w:left w:w="100" w:type="dxa"/>
-              <w:right w:w="100" w:type="dxa"/>
-            </w:tcMar>
-          </w:tcPr>
-          <w:p>
-            <w:r>
-              <w:rPr>
-                <w:rFonts w:ascii="Calibri" w:hAnsi="Calibri"/>
-                <w:color w:val="333333"/>
-                <w:sz w:val="17"/>
-              </w:rPr>
-              <w:t>Minggu 2</w:t>
-            </w:r>
-          </w:p>
-        </w:tc>
-        <w:tc>
-          <w:tcPr>
-            <w:tcW w:type="dxa" w:w="2592"/>
-            <w:shd w:fill="F8FAFC"/>
-            <w:tcMar>
-              <w:top w:w="60" w:type="dxa"/>
-              <w:bottom w:w="60" w:type="dxa"/>
-              <w:left w:w="100" w:type="dxa"/>
-              <w:right w:w="100" w:type="dxa"/>
-            </w:tcMar>
-          </w:tcPr>
-          <w:p>
-            <w:r>
-              <w:rPr>
-                <w:rFonts w:ascii="Calibri" w:hAnsi="Calibri"/>
-                <w:color w:val="333333"/>
-                <w:sz w:val="17"/>
-              </w:rPr>
-              <w:t>Domain &amp; Integrasi</w:t>
-            </w:r>
-          </w:p>
-        </w:tc>
-        <w:tc>
-          <w:tcPr>
-            <w:tcW w:type="dxa" w:w="5616"/>
-            <w:shd w:fill="F8FAFC"/>
-            <w:tcMar>
-              <w:top w:w="60" w:type="dxa"/>
-              <w:bottom w:w="60" w:type="dxa"/>
-              <w:left w:w="100" w:type="dxa"/>
-              <w:right w:w="100" w:type="dxa"/>
-            </w:tcMar>
-          </w:tcPr>
-          <w:p>
-            <w:r>
-              <w:rPr>
-                <w:rFonts w:ascii="Calibri" w:hAnsi="Calibri"/>
-                <w:color w:val="333333"/>
-                <w:sz w:val="17"/>
-              </w:rPr>
-              <w:t>1. Telaah payload XML CargoWise eAdaptor yang masuk.</w:t>
-              <w:br/>
-              <w:t>2. Pahami alur status shipment dari booking hingga delivery.</w:t>
-              <w:br/>
-              <w:t>3. Uji coba endpoint webhook staging.</w:t>
-            </w:r>
-          </w:p>
-        </w:tc>
-      </w:tr>
-      <w:tr>
-        <w:tc>
-          <w:tcPr>
-            <w:tcW w:type="dxa" w:w="1584"/>
-            <w:shd w:fill="FFFFFF"/>
-            <w:tcMar>
-              <w:top w:w="60" w:type="dxa"/>
-              <w:bottom w:w="60" w:type="dxa"/>
-              <w:left w:w="100" w:type="dxa"/>
-              <w:right w:w="100" w:type="dxa"/>
-            </w:tcMar>
-          </w:tcPr>
-          <w:p>
-            <w:r>
-              <w:rPr>
-                <w:rFonts w:ascii="Calibri" w:hAnsi="Calibri"/>
-                <w:color w:val="333333"/>
-                <w:sz w:val="17"/>
-              </w:rPr>
-              <w:t>Minggu 3</w:t>
-            </w:r>
-          </w:p>
-        </w:tc>
-        <w:tc>
-          <w:tcPr>
-            <w:tcW w:type="dxa" w:w="2592"/>
-            <w:shd w:fill="FFFFFF"/>
-            <w:tcMar>
-              <w:top w:w="60" w:type="dxa"/>
-              <w:bottom w:w="60" w:type="dxa"/>
-              <w:left w:w="100" w:type="dxa"/>
-              <w:right w:w="100" w:type="dxa"/>
-            </w:tcMar>
-          </w:tcPr>
-          <w:p>
-            <w:r>
-              <w:rPr>
-                <w:rFonts w:ascii="Calibri" w:hAnsi="Calibri"/>
-                <w:color w:val="333333"/>
-                <w:sz w:val="17"/>
-              </w:rPr>
-              <w:t>Fitur &amp; Bug Triage</w:t>
-            </w:r>
-          </w:p>
-        </w:tc>
-        <w:tc>
-          <w:tcPr>
-            <w:tcW w:type="dxa" w:w="5616"/>
-            <w:shd w:fill="FFFFFF"/>
-            <w:tcMar>
-              <w:top w:w="60" w:type="dxa"/>
-              <w:bottom w:w="60" w:type="dxa"/>
-              <w:left w:w="100" w:type="dxa"/>
-              <w:right w:w="100" w:type="dxa"/>
-            </w:tcMar>
-          </w:tcPr>
-          <w:p>
-            <w:r>
-              <w:rPr>
-                <w:rFonts w:ascii="Calibri" w:hAnsi="Calibri"/>
-                <w:color w:val="333333"/>
-                <w:sz w:val="17"/>
-              </w:rPr>
-              <w:t>1. Ambil task tiket pertama (misal: perbaikan validasi container atau rate calculation).</w:t>
-              <w:br/>
-              <w:t>2. Terapkan unit test xUnit / FluentAssertions.</w:t>
-              <w:br/>
-              <w:t>3. Review PR bersama supervisor (Marvin Christian).</w:t>
-            </w:r>
-          </w:p>
-        </w:tc>
-      </w:tr>
-      <w:tr>
-        <w:tc>
-          <w:tcPr>
-            <w:tcW w:type="dxa" w:w="1584"/>
-            <w:shd w:fill="F8FAFC"/>
-            <w:tcMar>
-              <w:top w:w="60" w:type="dxa"/>
-              <w:bottom w:w="60" w:type="dxa"/>
-              <w:left w:w="100" w:type="dxa"/>
-              <w:right w:w="100" w:type="dxa"/>
-            </w:tcMar>
-          </w:tcPr>
-          <w:p>
-            <w:r>
-              <w:rPr>
-                <w:rFonts w:ascii="Calibri" w:hAnsi="Calibri"/>
-                <w:color w:val="333333"/>
-                <w:sz w:val="17"/>
-              </w:rPr>
-              <w:t>Minggu 4</w:t>
-            </w:r>
-          </w:p>
-        </w:tc>
-        <w:tc>
-          <w:tcPr>
-            <w:tcW w:type="dxa" w:w="2592"/>
-            <w:shd w:fill="F8FAFC"/>
-            <w:tcMar>
-              <w:top w:w="60" w:type="dxa"/>
-              <w:bottom w:w="60" w:type="dxa"/>
-              <w:left w:w="100" w:type="dxa"/>
-              <w:right w:w="100" w:type="dxa"/>
-            </w:tcMar>
-          </w:tcPr>
-          <w:p>
-            <w:r>
-              <w:rPr>
-                <w:rFonts w:ascii="Calibri" w:hAnsi="Calibri"/>
-                <w:color w:val="333333"/>
-                <w:sz w:val="17"/>
-              </w:rPr>
-              <w:t>Optimasi &amp; Resiliency</w:t>
-            </w:r>
-          </w:p>
-        </w:tc>
-        <w:tc>
-          <w:tcPr>
-            <w:tcW w:type="dxa" w:w="5616"/>
-            <w:shd w:fill="F8FAFC"/>
-            <w:tcMar>
-              <w:top w:w="60" w:type="dxa"/>
-              <w:bottom w:w="60" w:type="dxa"/>
-              <w:left w:w="100" w:type="dxa"/>
-              <w:right w:w="100" w:type="dxa"/>
-            </w:tcMar>
-          </w:tcPr>
-          <w:p>
-            <w:r>
-              <w:rPr>
-                <w:rFonts w:ascii="Calibri" w:hAnsi="Calibri"/>
-                <w:color w:val="333333"/>
-                <w:sz w:val="17"/>
-              </w:rPr>
-              <w:t>1. Audit query EF Core untuk mencegah masalah N+1 (tambahkan AsNoTracking / Include).</w:t>
-              <w:br/>
-              <w:t>2. Review policy retry Polly pada koneksi eksternal.</w:t>
-              <w:br/>
-              <w:t>3. Pastikan logging serilog terstruktur dengan CorrelationId.</w:t>
-            </w:r>
-          </w:p>
-        </w:tc>
-      </w:tr>
-    </w:tbl>
-    <w:p>
-      <w:pPr>
-        <w:spacing w:after="60"/>
-      </w:pPr>
     </w:p>
     <w:tbl>
       <w:tblPr>
@@ -3001,7 +1546,7 @@
                 <w:color w:val="1E3A8A"/>
                 <w:sz w:val="20"/>
               </w:rPr>
-              <w:t>📌 CATATAN PENUTUP</w:t>
+              <w:t>📌 KESIMPULAN</w:t>
               <w:br/>
             </w:r>
             <w:r>
@@ -3010,7 +1555,7 @@
                 <w:color w:val="333333"/>
                 <w:sz w:val="19"/>
               </w:rPr>
-              <w:t>Kemampuan fondasi Anda di Go (concurrency, event-driven, idempotency) adalah modal yang sangat kuat di .NET. Dengan menguasai C# modern (records, pattern matching, async/await) dan ekosistem Microsoft (EF Core, MediatR, MassTransit), Anda akan mampu beradaptasi dengan sangat cepat dan memberikan dampak nyata di tim OneByOne Logistical.</w:t>
+              <w:t>Mini-project MiniFMS ini merangkum seluruh esensi backend logistik enterprise dalam skala kecil. Dengan menyelesaikannya, Anda akan sangat siap menghadapi codebase produksi di OneByOne Logistical.</w:t>
             </w:r>
           </w:p>
         </w:tc>
@@ -3045,7 +1590,7 @@
         <w:color w:val="808080"/>
         <w:sz w:val="17"/>
       </w:rPr>
-      <w:t>OneByOne Logistical — FMS Backend Engineering Guide (.NET &amp; MS Ecosystem) | Dewa Biara</w:t>
+      <w:t>OneByOne Logistical — FMS Backend Engineering Guide &amp; Mini-Project Blueprint | Dewa Biara</w:t>
     </w:r>
   </w:p>
 </w:ftr>

</xml_diff>